<commit_message>
Complete 14 Aug issue: 52-week lists, delivery movers, FII F&O, mover ratios from full-mode run
- 52w: 23 highs / 3 lows (GCPL, HDFC Bank, PI Industries) — lows mirror the week's news
- Delivery movers: rising (Newgen, FACT, Nuvoco, SBI Cards, Aegis) / falling (Signature Global, Sapphire, BEML, Finolex Cables, Devyani)
- FII F&O 5 sessions to 13 Aug: IdxFut -3,771.57 / StkFut -249.39 / IdxOpt -40,378.32 / StkOpt -2,956.38 cr
- Ratio cells: Bosch 1.8X, Solar 1.3X, Tata Motors 1.2X, GCPL 12.6X (conviction-exit note added), Max 1.4X
- Verification log added; DLF/PFC/REC/HZL ratios remain for the ~7pm evening refresh

Co-Authored-By: Claude Fable 5 <noreply@anthropic.com>
Claude-Session: https://claude.ai/code/session_01NDeVYnid9JhNYXfTo4RGQV
</commit_message>
<xml_diff>
--- a/drafts/2026-08-14/echo_draft.docx
+++ b/drafts/2026-08-14/echo_draft.docx
@@ -547,7 +547,7 @@
               <w:rPr>
                 <w:i w:val="0"/>
               </w:rPr>
-              <w:t>*(evening)*</w:t>
+              <w:t>1.8X</w:t>
             </w:r>
           </w:p>
         </w:tc>
@@ -591,7 +591,7 @@
               <w:rPr>
                 <w:i w:val="0"/>
               </w:rPr>
-              <w:t>*(evening)*</w:t>
+              <w:t>1.3X</w:t>
             </w:r>
           </w:p>
         </w:tc>
@@ -635,7 +635,7 @@
               <w:rPr>
                 <w:i w:val="0"/>
               </w:rPr>
-              <w:t>*(evening)*</w:t>
+              <w:t>1.2X</w:t>
             </w:r>
           </w:p>
         </w:tc>
@@ -956,7 +956,7 @@
               <w:rPr>
                 <w:i w:val="0"/>
               </w:rPr>
-              <w:t>*(evening)*</w:t>
+              <w:t>12.6X</w:t>
             </w:r>
           </w:p>
         </w:tc>
@@ -1132,7 +1132,7 @@
               <w:rPr>
                 <w:i w:val="0"/>
               </w:rPr>
-              <w:t>*(evening)*</w:t>
+              <w:t>1.4X</w:t>
             </w:r>
           </w:p>
         </w:tc>
@@ -1259,6 +1259,38 @@
         <w:rPr>
           <w:i w:val="0"/>
         </w:rPr>
+        <w:t>The delivery data puts a sharp edge on the Godrej story: delivered</w:t>
+      </w:r>
+    </w:p>
+    <w:p>
+      <w:r>
+        <w:rPr>
+          <w:i w:val="0"/>
+        </w:rPr>
+        <w:t>volumes ran at 12.6 times the monthly average while the stock fell 11%</w:t>
+      </w:r>
+    </w:p>
+    <w:p>
+      <w:r>
+        <w:rPr>
+          <w:i w:val="0"/>
+        </w:rPr>
+        <w:t>— that is not traders churning a headline, that is holders walking out</w:t>
+      </w:r>
+    </w:p>
+    <w:p>
+      <w:r>
+        <w:rPr>
+          <w:i w:val="0"/>
+        </w:rPr>
+        <w:t>the door.</w:t>
+      </w:r>
+    </w:p>
+    <w:p>
+      <w:r>
+        <w:rPr>
+          <w:i w:val="0"/>
+        </w:rPr>
         <w:t xml:space="preserve">Just outside the table, </w:t>
       </w:r>
       <w:r>
@@ -1342,9 +1374,127 @@
     <w:p>
       <w:r>
         <w:rPr>
+          <w:b/>
           <w:i w:val="0"/>
         </w:rPr>
-        <w:t>[FULL-52W]</w:t>
+        <w:t>Stocks that hit their 52-week high:</w:t>
+      </w:r>
+      <w:r>
+        <w:rPr>
+          <w:i w:val="0"/>
+        </w:rPr>
+        <w:t xml:space="preserve"> Aurobindo Pharma, Bajaj Auto,</w:t>
+      </w:r>
+    </w:p>
+    <w:p>
+      <w:r>
+        <w:rPr>
+          <w:i w:val="0"/>
+        </w:rPr>
+        <w:t>Bharat Forge, Bosch, Divi's Laboratories, Exide Industries, Grasim</w:t>
+      </w:r>
+    </w:p>
+    <w:p>
+      <w:r>
+        <w:rPr>
+          <w:i w:val="0"/>
+        </w:rPr>
+        <w:t>Industries, Hindustan Aeronautics, KEI Industries, LTM, Laurus Labs,</w:t>
+      </w:r>
+    </w:p>
+    <w:p>
+      <w:r>
+        <w:rPr>
+          <w:i w:val="0"/>
+        </w:rPr>
+        <w:t>Lenskart Solutions, Mahindra &amp; Mahindra Financial Services, Nestle</w:t>
+      </w:r>
+    </w:p>
+    <w:p>
+      <w:r>
+        <w:rPr>
+          <w:i w:val="0"/>
+        </w:rPr>
+        <w:t>India, One 97 Communications (Paytm), Radico Khaitan, Samvardhana</w:t>
+      </w:r>
+    </w:p>
+    <w:p>
+      <w:r>
+        <w:rPr>
+          <w:i w:val="0"/>
+        </w:rPr>
+        <w:t>Motherson, Siemens, Solar Industries, TVS Motor Company, Titan</w:t>
+      </w:r>
+    </w:p>
+    <w:p>
+      <w:r>
+        <w:rPr>
+          <w:i w:val="0"/>
+        </w:rPr>
+        <w:t>Company, United Spirits, and Zydus Lifesciences.</w:t>
+      </w:r>
+    </w:p>
+    <w:p>
+      <w:r>
+        <w:rPr>
+          <w:b/>
+          <w:i w:val="0"/>
+        </w:rPr>
+        <w:t>Stocks that hit their 52-week low:</w:t>
+      </w:r>
+      <w:r>
+        <w:rPr>
+          <w:i w:val="0"/>
+        </w:rPr>
+        <w:t xml:space="preserve"> Godrej Consumer Products, HDFC</w:t>
+      </w:r>
+    </w:p>
+    <w:p>
+      <w:r>
+        <w:rPr>
+          <w:i w:val="0"/>
+        </w:rPr>
+        <w:t>Bank, and PI Industries.</w:t>
+      </w:r>
+    </w:p>
+    <w:p>
+      <w:r>
+        <w:rPr>
+          <w:i w:val="0"/>
+        </w:rPr>
+        <w:t>Note: twenty-three highs against three lows — breadth at the top end</w:t>
+      </w:r>
+    </w:p>
+    <w:p>
+      <w:r>
+        <w:rPr>
+          <w:i w:val="0"/>
+        </w:rPr>
+        <w:t>stayed remarkably healthy for a down week. And the lows list reads</w:t>
+      </w:r>
+    </w:p>
+    <w:p>
+      <w:r>
+        <w:rPr>
+          <w:i w:val="0"/>
+        </w:rPr>
+        <w:t>like the week's news in miniature: Godrej Consumer after the CEO</w:t>
+      </w:r>
+    </w:p>
+    <w:p>
+      <w:r>
+        <w:rPr>
+          <w:i w:val="0"/>
+        </w:rPr>
+        <w:t>exit, HDFC Bank capping the banks' CPI-shock week, and PI Industries</w:t>
+      </w:r>
+    </w:p>
+    <w:p>
+      <w:r>
+        <w:rPr>
+          <w:i w:val="0"/>
+        </w:rPr>
+        <w:t>extending agrochem's long slump.</w:t>
       </w:r>
     </w:p>
     <w:p>
@@ -1724,12 +1874,425 @@
         <w:t>Rising Delivery Volume (Last week vs Prev month)</w:t>
       </w:r>
     </w:p>
+    <w:tbl>
+      <w:tblPr>
+        <w:tblStyle w:val="TableGrid"/>
+        <w:tblW w:type="auto" w:w="0"/>
+        <w:tblLook w:firstColumn="1" w:firstRow="1" w:lastColumn="0" w:lastRow="0" w:noHBand="0" w:noVBand="1" w:val="04A0"/>
+      </w:tblPr>
+      <w:tblGrid>
+        <w:gridCol w:w="2160"/>
+        <w:gridCol w:w="2160"/>
+        <w:gridCol w:w="2160"/>
+        <w:gridCol w:w="2160"/>
+      </w:tblGrid>
+      <w:tr>
+        <w:tc>
+          <w:tcPr>
+            <w:tcW w:type="dxa" w:w="2160"/>
+          </w:tcPr>
+          <w:p>
+            <w:r>
+              <w:rPr>
+                <w:b/>
+              </w:rPr>
+            </w:r>
+            <w:r>
+              <w:rPr>
+                <w:b/>
+                <w:i w:val="0"/>
+              </w:rPr>
+              <w:t>Stock Name</w:t>
+            </w:r>
+          </w:p>
+        </w:tc>
+        <w:tc>
+          <w:tcPr>
+            <w:tcW w:type="dxa" w:w="2160"/>
+          </w:tcPr>
+          <w:p>
+            <w:r>
+              <w:rPr>
+                <w:b/>
+              </w:rPr>
+            </w:r>
+            <w:r>
+              <w:rPr>
+                <w:b/>
+                <w:i w:val="0"/>
+              </w:rPr>
+              <w:t>Avg. delivery volume %</w:t>
+            </w:r>
+          </w:p>
+        </w:tc>
+        <w:tc>
+          <w:tcPr>
+            <w:tcW w:type="dxa" w:w="2160"/>
+          </w:tcPr>
+          <w:p>
+            <w:r>
+              <w:rPr>
+                <w:b/>
+              </w:rPr>
+            </w:r>
+            <w:r>
+              <w:rPr>
+                <w:b/>
+                <w:i w:val="0"/>
+              </w:rPr>
+              <w:t>Avg. month delivery volume %</w:t>
+            </w:r>
+          </w:p>
+        </w:tc>
+        <w:tc>
+          <w:tcPr>
+            <w:tcW w:type="dxa" w:w="2160"/>
+          </w:tcPr>
+          <w:p>
+            <w:r>
+              <w:rPr>
+                <w:b/>
+              </w:rPr>
+            </w:r>
+            <w:r>
+              <w:rPr>
+                <w:b/>
+                <w:i w:val="0"/>
+              </w:rPr>
+              <w:t>Avg. 6-month delivery volume %</w:t>
+            </w:r>
+          </w:p>
+        </w:tc>
+      </w:tr>
+      <w:tr>
+        <w:tc>
+          <w:tcPr>
+            <w:tcW w:type="dxa" w:w="2160"/>
+          </w:tcPr>
+          <w:p>
+            <w:r/>
+            <w:r>
+              <w:rPr>
+                <w:i w:val="0"/>
+              </w:rPr>
+              <w:t>Newgen Software Technologies</w:t>
+            </w:r>
+          </w:p>
+        </w:tc>
+        <w:tc>
+          <w:tcPr>
+            <w:tcW w:type="dxa" w:w="2160"/>
+          </w:tcPr>
+          <w:p>
+            <w:r/>
+            <w:r>
+              <w:rPr>
+                <w:i w:val="0"/>
+              </w:rPr>
+              <w:t>34.85%</w:t>
+            </w:r>
+          </w:p>
+        </w:tc>
+        <w:tc>
+          <w:tcPr>
+            <w:tcW w:type="dxa" w:w="2160"/>
+          </w:tcPr>
+          <w:p>
+            <w:r/>
+            <w:r>
+              <w:rPr>
+                <w:i w:val="0"/>
+              </w:rPr>
+              <w:t>21.41%</w:t>
+            </w:r>
+          </w:p>
+        </w:tc>
+        <w:tc>
+          <w:tcPr>
+            <w:tcW w:type="dxa" w:w="2160"/>
+          </w:tcPr>
+          <w:p>
+            <w:r/>
+            <w:r>
+              <w:rPr>
+                <w:i w:val="0"/>
+              </w:rPr>
+              <w:t>26.26%</w:t>
+            </w:r>
+          </w:p>
+        </w:tc>
+      </w:tr>
+      <w:tr>
+        <w:tc>
+          <w:tcPr>
+            <w:tcW w:type="dxa" w:w="2160"/>
+          </w:tcPr>
+          <w:p>
+            <w:r/>
+            <w:r>
+              <w:rPr>
+                <w:i w:val="0"/>
+              </w:rPr>
+              <w:t>Fertilisers and Chemicals Travancore (FACT)</w:t>
+            </w:r>
+          </w:p>
+        </w:tc>
+        <w:tc>
+          <w:tcPr>
+            <w:tcW w:type="dxa" w:w="2160"/>
+          </w:tcPr>
+          <w:p>
+            <w:r/>
+            <w:r>
+              <w:rPr>
+                <w:i w:val="0"/>
+              </w:rPr>
+              <w:t>47.65%</w:t>
+            </w:r>
+          </w:p>
+        </w:tc>
+        <w:tc>
+          <w:tcPr>
+            <w:tcW w:type="dxa" w:w="2160"/>
+          </w:tcPr>
+          <w:p>
+            <w:r/>
+            <w:r>
+              <w:rPr>
+                <w:i w:val="0"/>
+              </w:rPr>
+              <w:t>32.49%</w:t>
+            </w:r>
+          </w:p>
+        </w:tc>
+        <w:tc>
+          <w:tcPr>
+            <w:tcW w:type="dxa" w:w="2160"/>
+          </w:tcPr>
+          <w:p>
+            <w:r/>
+            <w:r>
+              <w:rPr>
+                <w:i w:val="0"/>
+              </w:rPr>
+              <w:t>26.65%</w:t>
+            </w:r>
+          </w:p>
+        </w:tc>
+      </w:tr>
+      <w:tr>
+        <w:tc>
+          <w:tcPr>
+            <w:tcW w:type="dxa" w:w="2160"/>
+          </w:tcPr>
+          <w:p>
+            <w:r/>
+            <w:r>
+              <w:rPr>
+                <w:i w:val="0"/>
+              </w:rPr>
+              <w:t>Nuvoco Vistas Corporation</w:t>
+            </w:r>
+          </w:p>
+        </w:tc>
+        <w:tc>
+          <w:tcPr>
+            <w:tcW w:type="dxa" w:w="2160"/>
+          </w:tcPr>
+          <w:p>
+            <w:r/>
+            <w:r>
+              <w:rPr>
+                <w:i w:val="0"/>
+              </w:rPr>
+              <w:t>51.80%</w:t>
+            </w:r>
+          </w:p>
+        </w:tc>
+        <w:tc>
+          <w:tcPr>
+            <w:tcW w:type="dxa" w:w="2160"/>
+          </w:tcPr>
+          <w:p>
+            <w:r/>
+            <w:r>
+              <w:rPr>
+                <w:i w:val="0"/>
+              </w:rPr>
+              <w:t>35.16%</w:t>
+            </w:r>
+          </w:p>
+        </w:tc>
+        <w:tc>
+          <w:tcPr>
+            <w:tcW w:type="dxa" w:w="2160"/>
+          </w:tcPr>
+          <w:p>
+            <w:r/>
+            <w:r>
+              <w:rPr>
+                <w:i w:val="0"/>
+              </w:rPr>
+              <w:t>45.78%</w:t>
+            </w:r>
+          </w:p>
+        </w:tc>
+      </w:tr>
+      <w:tr>
+        <w:tc>
+          <w:tcPr>
+            <w:tcW w:type="dxa" w:w="2160"/>
+          </w:tcPr>
+          <w:p>
+            <w:r/>
+            <w:r>
+              <w:rPr>
+                <w:i w:val="0"/>
+              </w:rPr>
+              <w:t>SBI Cards and Payment Services</w:t>
+            </w:r>
+          </w:p>
+        </w:tc>
+        <w:tc>
+          <w:tcPr>
+            <w:tcW w:type="dxa" w:w="2160"/>
+          </w:tcPr>
+          <w:p>
+            <w:r/>
+            <w:r>
+              <w:rPr>
+                <w:i w:val="0"/>
+              </w:rPr>
+              <w:t>62.30%</w:t>
+            </w:r>
+          </w:p>
+        </w:tc>
+        <w:tc>
+          <w:tcPr>
+            <w:tcW w:type="dxa" w:w="2160"/>
+          </w:tcPr>
+          <w:p>
+            <w:r/>
+            <w:r>
+              <w:rPr>
+                <w:i w:val="0"/>
+              </w:rPr>
+              <w:t>42.41%</w:t>
+            </w:r>
+          </w:p>
+        </w:tc>
+        <w:tc>
+          <w:tcPr>
+            <w:tcW w:type="dxa" w:w="2160"/>
+          </w:tcPr>
+          <w:p>
+            <w:r/>
+            <w:r>
+              <w:rPr>
+                <w:i w:val="0"/>
+              </w:rPr>
+              <w:t>43.75%</w:t>
+            </w:r>
+          </w:p>
+        </w:tc>
+      </w:tr>
+      <w:tr>
+        <w:tc>
+          <w:tcPr>
+            <w:tcW w:type="dxa" w:w="2160"/>
+          </w:tcPr>
+          <w:p>
+            <w:r/>
+            <w:r>
+              <w:rPr>
+                <w:i w:val="0"/>
+              </w:rPr>
+              <w:t>Aegis Logistics</w:t>
+            </w:r>
+          </w:p>
+        </w:tc>
+        <w:tc>
+          <w:tcPr>
+            <w:tcW w:type="dxa" w:w="2160"/>
+          </w:tcPr>
+          <w:p>
+            <w:r/>
+            <w:r>
+              <w:rPr>
+                <w:i w:val="0"/>
+              </w:rPr>
+              <w:t>41.00%</w:t>
+            </w:r>
+          </w:p>
+        </w:tc>
+        <w:tc>
+          <w:tcPr>
+            <w:tcW w:type="dxa" w:w="2160"/>
+          </w:tcPr>
+          <w:p>
+            <w:r/>
+            <w:r>
+              <w:rPr>
+                <w:i w:val="0"/>
+              </w:rPr>
+              <w:t>28.95%</w:t>
+            </w:r>
+          </w:p>
+        </w:tc>
+        <w:tc>
+          <w:tcPr>
+            <w:tcW w:type="dxa" w:w="2160"/>
+          </w:tcPr>
+          <w:p>
+            <w:r/>
+            <w:r>
+              <w:rPr>
+                <w:i w:val="0"/>
+              </w:rPr>
+              <w:t>36.30%</w:t>
+            </w:r>
+          </w:p>
+        </w:tc>
+      </w:tr>
+    </w:tbl>
+    <w:p/>
+    <w:p>
+      <w:r>
+        <w:rPr>
+          <w:b/>
+          <w:i w:val="0"/>
+        </w:rPr>
+        <w:t>SBI Cards</w:t>
+      </w:r>
+      <w:r>
+        <w:rPr>
+          <w:i w:val="0"/>
+        </w:rPr>
+        <w:t xml:space="preserve"> stands out: nearly two-thirds of its traded volume went</w:t>
+      </w:r>
+    </w:p>
     <w:p>
       <w:r>
         <w:rPr>
           <w:i w:val="0"/>
         </w:rPr>
-        <w:t>[FULL-DELIV-RISING]</w:t>
+        <w:t>to delivery last week, well above both its monthly and six-month</w:t>
+      </w:r>
+    </w:p>
+    <w:p>
+      <w:r>
+        <w:rPr>
+          <w:i w:val="0"/>
+        </w:rPr>
+        <w:t>habits — quiet, deliberate accumulation in a week when credit</w:t>
+      </w:r>
+    </w:p>
+    <w:p>
+      <w:r>
+        <w:rPr>
+          <w:i w:val="0"/>
+        </w:rPr>
+        <w:t>appetite was being repriced.</w:t>
       </w:r>
     </w:p>
     <w:p>
@@ -1740,14 +2303,388 @@
         <w:t>Falling delivery volume (Last week vs Prev month)</w:t>
       </w:r>
     </w:p>
-    <w:p>
-      <w:r>
-        <w:rPr>
-          <w:i w:val="0"/>
-        </w:rPr>
-        <w:t>[FULL-DELIV-FALLING]</w:t>
-      </w:r>
-    </w:p>
+    <w:tbl>
+      <w:tblPr>
+        <w:tblStyle w:val="TableGrid"/>
+        <w:tblW w:type="auto" w:w="0"/>
+        <w:tblLook w:firstColumn="1" w:firstRow="1" w:lastColumn="0" w:lastRow="0" w:noHBand="0" w:noVBand="1" w:val="04A0"/>
+      </w:tblPr>
+      <w:tblGrid>
+        <w:gridCol w:w="2160"/>
+        <w:gridCol w:w="2160"/>
+        <w:gridCol w:w="2160"/>
+        <w:gridCol w:w="2160"/>
+      </w:tblGrid>
+      <w:tr>
+        <w:tc>
+          <w:tcPr>
+            <w:tcW w:type="dxa" w:w="2160"/>
+          </w:tcPr>
+          <w:p>
+            <w:r>
+              <w:rPr>
+                <w:b/>
+              </w:rPr>
+            </w:r>
+            <w:r>
+              <w:rPr>
+                <w:b/>
+                <w:i w:val="0"/>
+              </w:rPr>
+              <w:t>Stock Name</w:t>
+            </w:r>
+          </w:p>
+        </w:tc>
+        <w:tc>
+          <w:tcPr>
+            <w:tcW w:type="dxa" w:w="2160"/>
+          </w:tcPr>
+          <w:p>
+            <w:r>
+              <w:rPr>
+                <w:b/>
+              </w:rPr>
+            </w:r>
+            <w:r>
+              <w:rPr>
+                <w:b/>
+                <w:i w:val="0"/>
+              </w:rPr>
+              <w:t>Avg. delivery volume %</w:t>
+            </w:r>
+          </w:p>
+        </w:tc>
+        <w:tc>
+          <w:tcPr>
+            <w:tcW w:type="dxa" w:w="2160"/>
+          </w:tcPr>
+          <w:p>
+            <w:r>
+              <w:rPr>
+                <w:b/>
+              </w:rPr>
+            </w:r>
+            <w:r>
+              <w:rPr>
+                <w:b/>
+                <w:i w:val="0"/>
+              </w:rPr>
+              <w:t>Avg. month delivery volume %</w:t>
+            </w:r>
+          </w:p>
+        </w:tc>
+        <w:tc>
+          <w:tcPr>
+            <w:tcW w:type="dxa" w:w="2160"/>
+          </w:tcPr>
+          <w:p>
+            <w:r>
+              <w:rPr>
+                <w:b/>
+              </w:rPr>
+            </w:r>
+            <w:r>
+              <w:rPr>
+                <w:b/>
+                <w:i w:val="0"/>
+              </w:rPr>
+              <w:t>Avg. 6-month delivery volume %</w:t>
+            </w:r>
+          </w:p>
+        </w:tc>
+      </w:tr>
+      <w:tr>
+        <w:tc>
+          <w:tcPr>
+            <w:tcW w:type="dxa" w:w="2160"/>
+          </w:tcPr>
+          <w:p>
+            <w:r/>
+            <w:r>
+              <w:rPr>
+                <w:i w:val="0"/>
+              </w:rPr>
+              <w:t>Signatureglobal (India)</w:t>
+            </w:r>
+          </w:p>
+        </w:tc>
+        <w:tc>
+          <w:tcPr>
+            <w:tcW w:type="dxa" w:w="2160"/>
+          </w:tcPr>
+          <w:p>
+            <w:r/>
+            <w:r>
+              <w:rPr>
+                <w:i w:val="0"/>
+              </w:rPr>
+              <w:t>7.24%</w:t>
+            </w:r>
+          </w:p>
+        </w:tc>
+        <w:tc>
+          <w:tcPr>
+            <w:tcW w:type="dxa" w:w="2160"/>
+          </w:tcPr>
+          <w:p>
+            <w:r/>
+            <w:r>
+              <w:rPr>
+                <w:i w:val="0"/>
+              </w:rPr>
+              <w:t>15.95%</w:t>
+            </w:r>
+          </w:p>
+        </w:tc>
+        <w:tc>
+          <w:tcPr>
+            <w:tcW w:type="dxa" w:w="2160"/>
+          </w:tcPr>
+          <w:p>
+            <w:r/>
+            <w:r>
+              <w:rPr>
+                <w:i w:val="0"/>
+              </w:rPr>
+              <w:t>16.38%</w:t>
+            </w:r>
+          </w:p>
+        </w:tc>
+      </w:tr>
+      <w:tr>
+        <w:tc>
+          <w:tcPr>
+            <w:tcW w:type="dxa" w:w="2160"/>
+          </w:tcPr>
+          <w:p>
+            <w:r/>
+            <w:r>
+              <w:rPr>
+                <w:i w:val="0"/>
+              </w:rPr>
+              <w:t>Sapphire Foods India</w:t>
+            </w:r>
+          </w:p>
+        </w:tc>
+        <w:tc>
+          <w:tcPr>
+            <w:tcW w:type="dxa" w:w="2160"/>
+          </w:tcPr>
+          <w:p>
+            <w:r/>
+            <w:r>
+              <w:rPr>
+                <w:i w:val="0"/>
+              </w:rPr>
+              <w:t>24.02%</w:t>
+            </w:r>
+          </w:p>
+        </w:tc>
+        <w:tc>
+          <w:tcPr>
+            <w:tcW w:type="dxa" w:w="2160"/>
+          </w:tcPr>
+          <w:p>
+            <w:r/>
+            <w:r>
+              <w:rPr>
+                <w:i w:val="0"/>
+              </w:rPr>
+              <w:t>50.30%</w:t>
+            </w:r>
+          </w:p>
+        </w:tc>
+        <w:tc>
+          <w:tcPr>
+            <w:tcW w:type="dxa" w:w="2160"/>
+          </w:tcPr>
+          <w:p>
+            <w:r/>
+            <w:r>
+              <w:rPr>
+                <w:i w:val="0"/>
+              </w:rPr>
+              <w:t>47.16%</w:t>
+            </w:r>
+          </w:p>
+        </w:tc>
+      </w:tr>
+      <w:tr>
+        <w:tc>
+          <w:tcPr>
+            <w:tcW w:type="dxa" w:w="2160"/>
+          </w:tcPr>
+          <w:p>
+            <w:r/>
+            <w:r>
+              <w:rPr>
+                <w:i w:val="0"/>
+              </w:rPr>
+              <w:t>BEML</w:t>
+            </w:r>
+          </w:p>
+        </w:tc>
+        <w:tc>
+          <w:tcPr>
+            <w:tcW w:type="dxa" w:w="2160"/>
+          </w:tcPr>
+          <w:p>
+            <w:r/>
+            <w:r>
+              <w:rPr>
+                <w:i w:val="0"/>
+              </w:rPr>
+              <w:t>26.02%</w:t>
+            </w:r>
+          </w:p>
+        </w:tc>
+        <w:tc>
+          <w:tcPr>
+            <w:tcW w:type="dxa" w:w="2160"/>
+          </w:tcPr>
+          <w:p>
+            <w:r/>
+            <w:r>
+              <w:rPr>
+                <w:i w:val="0"/>
+              </w:rPr>
+              <w:t>47.27%</w:t>
+            </w:r>
+          </w:p>
+        </w:tc>
+        <w:tc>
+          <w:tcPr>
+            <w:tcW w:type="dxa" w:w="2160"/>
+          </w:tcPr>
+          <w:p>
+            <w:r/>
+            <w:r>
+              <w:rPr>
+                <w:i w:val="0"/>
+              </w:rPr>
+              <w:t>37.42%</w:t>
+            </w:r>
+          </w:p>
+        </w:tc>
+      </w:tr>
+      <w:tr>
+        <w:tc>
+          <w:tcPr>
+            <w:tcW w:type="dxa" w:w="2160"/>
+          </w:tcPr>
+          <w:p>
+            <w:r/>
+            <w:r>
+              <w:rPr>
+                <w:i w:val="0"/>
+              </w:rPr>
+              <w:t>Finolex Cables</w:t>
+            </w:r>
+          </w:p>
+        </w:tc>
+        <w:tc>
+          <w:tcPr>
+            <w:tcW w:type="dxa" w:w="2160"/>
+          </w:tcPr>
+          <w:p>
+            <w:r/>
+            <w:r>
+              <w:rPr>
+                <w:i w:val="0"/>
+              </w:rPr>
+              <w:t>27.40%</w:t>
+            </w:r>
+          </w:p>
+        </w:tc>
+        <w:tc>
+          <w:tcPr>
+            <w:tcW w:type="dxa" w:w="2160"/>
+          </w:tcPr>
+          <w:p>
+            <w:r/>
+            <w:r>
+              <w:rPr>
+                <w:i w:val="0"/>
+              </w:rPr>
+              <w:t>48.11%</w:t>
+            </w:r>
+          </w:p>
+        </w:tc>
+        <w:tc>
+          <w:tcPr>
+            <w:tcW w:type="dxa" w:w="2160"/>
+          </w:tcPr>
+          <w:p>
+            <w:r/>
+            <w:r>
+              <w:rPr>
+                <w:i w:val="0"/>
+              </w:rPr>
+              <w:t>42.69%</w:t>
+            </w:r>
+          </w:p>
+        </w:tc>
+      </w:tr>
+      <w:tr>
+        <w:tc>
+          <w:tcPr>
+            <w:tcW w:type="dxa" w:w="2160"/>
+          </w:tcPr>
+          <w:p>
+            <w:r/>
+            <w:r>
+              <w:rPr>
+                <w:i w:val="0"/>
+              </w:rPr>
+              <w:t>Devyani International</w:t>
+            </w:r>
+          </w:p>
+        </w:tc>
+        <w:tc>
+          <w:tcPr>
+            <w:tcW w:type="dxa" w:w="2160"/>
+          </w:tcPr>
+          <w:p>
+            <w:r/>
+            <w:r>
+              <w:rPr>
+                <w:i w:val="0"/>
+              </w:rPr>
+              <w:t>28.38%</w:t>
+            </w:r>
+          </w:p>
+        </w:tc>
+        <w:tc>
+          <w:tcPr>
+            <w:tcW w:type="dxa" w:w="2160"/>
+          </w:tcPr>
+          <w:p>
+            <w:r/>
+            <w:r>
+              <w:rPr>
+                <w:i w:val="0"/>
+              </w:rPr>
+              <w:t>44.72%</w:t>
+            </w:r>
+          </w:p>
+        </w:tc>
+        <w:tc>
+          <w:tcPr>
+            <w:tcW w:type="dxa" w:w="2160"/>
+          </w:tcPr>
+          <w:p>
+            <w:r/>
+            <w:r>
+              <w:rPr>
+                <w:i w:val="0"/>
+              </w:rPr>
+              <w:t>43.52%</w:t>
+            </w:r>
+          </w:p>
+        </w:tc>
+      </w:tr>
+    </w:tbl>
+    <w:p/>
     <w:p>
       <w:pPr>
         <w:pStyle w:val="Heading1"/>
@@ -2202,7 +3139,7 @@
               <w:rPr>
                 <w:i w:val="0"/>
               </w:rPr>
-              <w:t>[FULL-FNO]</w:t>
+              <w:t>-3,771.57</w:t>
             </w:r>
           </w:p>
         </w:tc>
@@ -2216,7 +3153,7 @@
               <w:rPr>
                 <w:i w:val="0"/>
               </w:rPr>
-              <w:t>[FULL-FNO]</w:t>
+              <w:t>-249.39</w:t>
             </w:r>
           </w:p>
         </w:tc>
@@ -2230,7 +3167,7 @@
               <w:rPr>
                 <w:i w:val="0"/>
               </w:rPr>
-              <w:t>[FULL-FNO]</w:t>
+              <w:t>-40,378.32</w:t>
             </w:r>
           </w:p>
         </w:tc>
@@ -2244,7 +3181,7 @@
               <w:rPr>
                 <w:i w:val="0"/>
               </w:rPr>
-              <w:t>[FULL-FNO]</w:t>
+              <w:t>-2,956.38</w:t>
             </w:r>
           </w:p>
         </w:tc>
@@ -3912,30 +4849,6 @@
               <w:rPr>
                 <w:i w:val="0"/>
               </w:rPr>
-              <w:t>[FULL-CALENDAR]</w:t>
-            </w:r>
-          </w:p>
-        </w:tc>
-        <w:tc>
-          <w:tcPr>
-            <w:tcW w:type="dxa" w:w="4320"/>
-          </w:tcPr>
-          <w:p>
-            <w:r/>
-          </w:p>
-        </w:tc>
-      </w:tr>
-      <w:tr>
-        <w:tc>
-          <w:tcPr>
-            <w:tcW w:type="dxa" w:w="4320"/>
-          </w:tcPr>
-          <w:p>
-            <w:r/>
-            <w:r>
-              <w:rPr>
-                <w:i w:val="0"/>
-              </w:rPr>
               <w:t>21-Aug</w:t>
             </w:r>
           </w:p>

</xml_diff>

<commit_message>
Evening refresh complete: all ratio cells filled, Friday-official verification
- DLF 0.5X (narrative corrected: thin-delivery rally, not accumulation), PFC 2.3X, REC 2.4X (conviction-selling note added)
- All shipped Fri-Fri percentages and index closes verified exact vs NSE Friday files
- Verification log updated; Saturday settle run finalizes commodities/forex

Co-Authored-By: Claude Fable 5 <noreply@anthropic.com>
Claude-Session: https://claude.ai/code/session_01NDeVYnid9JhNYXfTo4RGQV
</commit_message>
<xml_diff>
--- a/drafts/2026-08-14/echo_draft.docx
+++ b/drafts/2026-08-14/echo_draft.docx
@@ -112,7 +112,7 @@
         <w:rPr>
           <w:i w:val="0"/>
         </w:rPr>
-        <w:t>Foreign investors told the story in miniature: buyers on Monday, sellers</w:t>
+        <w:t>Foreign investors told the story in miniature: buyers on Monday,</w:t>
       </w:r>
     </w:p>
     <w:p>
@@ -120,7 +120,7 @@
         <w:rPr>
           <w:i w:val="0"/>
         </w:rPr>
-        <w:t>every session after the CPI landed. Domestic institutions, as ever,</w:t>
+        <w:t>sellers once the CPI landed, and only a tentative return on Friday. Domestic institutions, as ever,</w:t>
       </w:r>
     </w:p>
     <w:p>
@@ -723,7 +723,7 @@
               <w:rPr>
                 <w:i w:val="0"/>
               </w:rPr>
-              <w:t>*(evening)*</w:t>
+              <w:t>0.5X</w:t>
             </w:r>
           </w:p>
         </w:tc>
@@ -828,7 +828,7 @@
         <w:rPr>
           <w:i w:val="0"/>
         </w:rPr>
-        <w:t xml:space="preserve"> led realty's quiet week of</w:t>
+        <w:t xml:space="preserve"> rose on noticeably thin delivery — at</w:t>
       </w:r>
     </w:p>
     <w:p>
@@ -836,7 +836,15 @@
         <w:rPr>
           <w:i w:val="0"/>
         </w:rPr>
-        <w:t>accumulation.</w:t>
+        <w:t>half its monthly average, that is a trader's move, not yet an</w:t>
+      </w:r>
+    </w:p>
+    <w:p>
+      <w:r>
+        <w:rPr>
+          <w:i w:val="0"/>
+        </w:rPr>
+        <w:t>investor's.</w:t>
       </w:r>
     </w:p>
     <w:p>
@@ -1000,7 +1008,7 @@
               <w:rPr>
                 <w:i w:val="0"/>
               </w:rPr>
-              <w:t>*(evening)*</w:t>
+              <w:t>2.3X</w:t>
             </w:r>
           </w:p>
         </w:tc>
@@ -1044,7 +1052,7 @@
               <w:rPr>
                 <w:i w:val="0"/>
               </w:rPr>
-              <w:t>*(evening)*</w:t>
+              <w:t>2.4X</w:t>
             </w:r>
           </w:p>
         </w:tc>
@@ -1088,7 +1096,7 @@
               <w:rPr>
                 <w:i w:val="0"/>
               </w:rPr>
-              <w:t>*(evening)*</w:t>
+              <w:t>1.3X</w:t>
             </w:r>
           </w:p>
         </w:tc>
@@ -1209,7 +1217,23 @@
         <w:rPr>
           <w:i w:val="0"/>
         </w:rPr>
-        <w:t xml:space="preserve">market newly nervous about the rate cycle, </w:t>
+        <w:t>market newly nervous about the rate cycle — both on delivery volumes</w:t>
+      </w:r>
+    </w:p>
+    <w:p>
+      <w:r>
+        <w:rPr>
+          <w:i w:val="0"/>
+        </w:rPr>
+        <w:t>more than double their monthly run-rate, conviction selling rather than</w:t>
+      </w:r>
+    </w:p>
+    <w:p>
+      <w:r>
+        <w:rPr>
+          <w:i w:val="0"/>
+        </w:rPr>
+        <w:t xml:space="preserve">mere profit-taking — </w:t>
       </w:r>
       <w:r>
         <w:rPr>
@@ -2878,7 +2902,7 @@
         <w:rPr>
           <w:i w:val="0"/>
         </w:rPr>
-        <w:t>Foreign investors began the week as buyers and ended it in retreat —</w:t>
+        <w:t>Foreign investors began the week as buyers, turned sellers the moment</w:t>
       </w:r>
     </w:p>
     <w:p>
@@ -2886,7 +2910,7 @@
         <w:rPr>
           <w:i w:val="0"/>
         </w:rPr>
-        <w:t>nearly ₹2,000 crore bought on Monday, then steady selling from the</w:t>
+        <w:t>Wednesday's inflation print landed, and crept back only on Friday —</w:t>
       </w:r>
     </w:p>
     <w:p>
@@ -2894,7 +2918,7 @@
         <w:rPr>
           <w:i w:val="0"/>
         </w:rPr>
-        <w:t>moment Wednesday's inflation print landed, leaving them barely ₹720</w:t>
+        <w:t>nearly ₹2,000 crore bought on Monday, two straight sessions of selling</w:t>
       </w:r>
     </w:p>
     <w:p>
@@ -2902,7 +2926,7 @@
         <w:rPr>
           <w:i w:val="0"/>
         </w:rPr>
-        <w:t>crore positive for the four sessions to Thursday. The three-week buying</w:t>
+        <w:t>after the CPI, then a tentative ₹508 crore return before the long</w:t>
       </w:r>
     </w:p>
     <w:p>
@@ -2910,7 +2934,7 @@
         <w:rPr>
           <w:i w:val="0"/>
         </w:rPr>
-        <w:t>streak survives, but only just, and the CPI surprise is plainly the</w:t>
+        <w:t>weekend, leaving them ₹1,228 crore positive for the week. The</w:t>
       </w:r>
     </w:p>
     <w:p>
@@ -2918,7 +2942,15 @@
         <w:rPr>
           <w:i w:val="0"/>
         </w:rPr>
-        <w:t>reason.</w:t>
+        <w:t>three-week buying streak survives, but the conviction has clearly</w:t>
+      </w:r>
+    </w:p>
+    <w:p>
+      <w:r>
+        <w:rPr>
+          <w:i w:val="0"/>
+        </w:rPr>
+        <w:t>thinned, and the CPI surprise is plainly the reason.</w:t>
       </w:r>
     </w:p>
     <w:p>
@@ -2942,7 +2974,7 @@
         <w:rPr>
           <w:i w:val="0"/>
         </w:rPr>
-        <w:t>₹4,350 crore more on Thursday, closing the four sessions nearly ₹9,000</w:t>
+        <w:t>₹4,350 crore more on Thursday, closing the week ₹9,286 crore net</w:t>
       </w:r>
     </w:p>
     <w:p>
@@ -2950,7 +2982,7 @@
         <w:rPr>
           <w:i w:val="0"/>
         </w:rPr>
-        <w:t>crore net positive — the year's familiar pattern, holding firm under</w:t>
+        <w:t>positive — the year's familiar pattern, holding firm under</w:t>
       </w:r>
     </w:p>
     <w:p>
@@ -3125,7 +3157,7 @@
               <w:rPr>
                 <w:i w:val="0"/>
               </w:rPr>
-              <w:t>720.12</w:t>
+              <w:t>1,228.24</w:t>
             </w:r>
           </w:p>
         </w:tc>
@@ -3211,7 +3243,7 @@
               <w:rPr>
                 <w:i w:val="0"/>
               </w:rPr>
-              <w:t>8,929.23</w:t>
+              <w:t>9,285.63</w:t>
             </w:r>
           </w:p>
         </w:tc>
@@ -3438,7 +3470,7 @@
               <w:rPr>
                 <w:i w:val="0"/>
               </w:rPr>
-              <w:t>-3,47,915.01</w:t>
+              <w:t>-3,47,406.89</w:t>
             </w:r>
           </w:p>
         </w:tc>
@@ -3524,7 +3556,7 @@
               <w:rPr>
                 <w:i w:val="0"/>
               </w:rPr>
-              <w:t>5,21,932.97</w:t>
+              <w:t>5,22,289.37</w:t>
             </w:r>
           </w:p>
         </w:tc>
@@ -3592,7 +3624,7 @@
         <w:rPr>
           <w:i w:val="0"/>
         </w:rPr>
-        <w:t>*Note: FII/DII cash and F&amp;O data as of 13th August; year-to-date cash</w:t>
+        <w:t>*Note: FII/DII cash data covers the full week to 14th August; F&amp;O data</w:t>
       </w:r>
     </w:p>
     <w:p>
@@ -3600,7 +3632,15 @@
         <w:rPr>
           <w:i w:val="0"/>
         </w:rPr>
-        <w:t>carried forward from the previous issue with official daily flows.*</w:t>
+        <w:t>as of 13th August. Year-to-date cash carried forward from the previous</w:t>
+      </w:r>
+    </w:p>
+    <w:p>
+      <w:r>
+        <w:rPr>
+          <w:i w:val="0"/>
+        </w:rPr>
+        <w:t>issue with official daily flows.*</w:t>
       </w:r>
     </w:p>
     <w:p>

</xml_diff>